<commit_message>
Corrected annual industry categories
Fixed the industries so that they match in the annual data
</commit_message>
<xml_diff>
--- a/Data/Raw/ReadME.docx
+++ b/Data/Raw/ReadME.docx
@@ -1,6 +1,6 @@
 
 <file path=word/document.xml><?xml version="1.0" encoding="utf-8"?>
-<w:document xmlns:wpc="http://schemas.microsoft.com/office/word/2010/wordprocessingCanvas" xmlns:cx="http://schemas.microsoft.com/office/drawing/2014/chartex" xmlns:cx1="http://schemas.microsoft.com/office/drawing/2015/9/8/chartex" xmlns:cx2="http://schemas.microsoft.com/office/drawing/2015/10/21/chartex" xmlns:cx3="http://schemas.microsoft.com/office/drawing/2016/5/9/chartex" xmlns:cx4="http://schemas.microsoft.com/office/drawing/2016/5/10/chartex" xmlns:cx5="http://schemas.microsoft.com/office/drawing/2016/5/11/chartex" xmlns:cx6="http://schemas.microsoft.com/office/drawing/2016/5/12/chartex" xmlns:cx7="http://schemas.microsoft.com/office/drawing/2016/5/13/chartex" xmlns:cx8="http://schemas.microsoft.com/office/drawing/2016/5/14/chartex" xmlns:mc="http://schemas.openxmlformats.org/markup-compatibility/2006" xmlns:aink="http://schemas.microsoft.com/office/drawing/2016/ink" xmlns:am3d="http://schemas.microsoft.com/office/drawing/2017/model3d" xmlns:o="urn:schemas-microsoft-com:office:office" xmlns:oel="http://schemas.microsoft.com/office/2019/extlst" xmlns:r="http://schemas.openxmlformats.org/officeDocument/2006/relationships" xmlns:m="http://schemas.openxmlformats.org/officeDocument/2006/math" xmlns:v="urn:schemas-microsoft-com:vml" xmlns:wp14="http://schemas.microsoft.com/office/word/2010/wordprocessingDrawing" xmlns:wp="http://schemas.openxmlformats.org/drawingml/2006/wordprocessingDrawing" xmlns:w10="urn:schemas-microsoft-com:office:word" xmlns:w="http://schemas.openxmlformats.org/wordprocessingml/2006/main" xmlns:w14="http://schemas.microsoft.com/office/word/2010/wordml" xmlns:w15="http://schemas.microsoft.com/office/word/2012/wordml" xmlns:w16cex="http://schemas.microsoft.com/office/word/2018/wordml/cex" xmlns:w16cid="http://schemas.microsoft.com/office/word/2016/wordml/cid" xmlns:w16="http://schemas.microsoft.com/office/word/2018/wordml" xmlns:w16du="http://schemas.microsoft.com/office/word/2023/wordml/word16du" xmlns:w16sdtdh="http://schemas.microsoft.com/office/word/2020/wordml/sdtdatahash" xmlns:w16se="http://schemas.microsoft.com/office/word/2015/wordml/symex" xmlns:wpg="http://schemas.microsoft.com/office/word/2010/wordprocessingGroup" xmlns:wpi="http://schemas.microsoft.com/office/word/2010/wordprocessingInk" xmlns:wne="http://schemas.microsoft.com/office/word/2006/wordml" xmlns:wps="http://schemas.microsoft.com/office/word/2010/wordprocessingShape" mc:Ignorable="w14 w15 w16se w16cid w16 w16cex w16sdtdh w16du wp14">
+<w:document xmlns:wpc="http://schemas.microsoft.com/office/word/2010/wordprocessingCanvas" xmlns:cx="http://schemas.microsoft.com/office/drawing/2014/chartex" xmlns:cx1="http://schemas.microsoft.com/office/drawing/2015/9/8/chartex" xmlns:cx2="http://schemas.microsoft.com/office/drawing/2015/10/21/chartex" xmlns:cx3="http://schemas.microsoft.com/office/drawing/2016/5/9/chartex" xmlns:cx4="http://schemas.microsoft.com/office/drawing/2016/5/10/chartex" xmlns:cx5="http://schemas.microsoft.com/office/drawing/2016/5/11/chartex" xmlns:cx6="http://schemas.microsoft.com/office/drawing/2016/5/12/chartex" xmlns:cx7="http://schemas.microsoft.com/office/drawing/2016/5/13/chartex" xmlns:cx8="http://schemas.microsoft.com/office/drawing/2016/5/14/chartex" xmlns:mc="http://schemas.openxmlformats.org/markup-compatibility/2006" xmlns:m="http://schemas.openxmlformats.org/officeDocument/2006/math" xmlns:aink="http://schemas.microsoft.com/office/drawing/2016/ink" xmlns:am3d="http://schemas.microsoft.com/office/drawing/2017/model3d" xmlns:oel="http://schemas.microsoft.com/office/2019/extlst" xmlns:r="http://schemas.openxmlformats.org/officeDocument/2006/relationships" xmlns:wp14="http://schemas.microsoft.com/office/word/2010/wordprocessingDrawing" xmlns:wp="http://schemas.openxmlformats.org/drawingml/2006/wordprocessingDrawing" xmlns:wpg="http://schemas.microsoft.com/office/word/2010/wordprocessingGroup" xmlns:wpi="http://schemas.microsoft.com/office/word/2010/wordprocessingInk" xmlns:wps="http://schemas.microsoft.com/office/word/2010/wordprocessingShape" xmlns:o="urn:schemas-microsoft-com:office:office" xmlns:v="urn:schemas-microsoft-com:vml" xmlns:w10="urn:schemas-microsoft-com:office:word" xmlns:w="http://schemas.openxmlformats.org/wordprocessingml/2006/main" xmlns:w14="http://schemas.microsoft.com/office/word/2010/wordml" xmlns:w15="http://schemas.microsoft.com/office/word/2012/wordml" xmlns:w16cei="http://schemas.microsoft.com/office/word/2026/wordml/cei" xmlns:w16cex="http://schemas.microsoft.com/office/word/2018/wordml/cex" xmlns:w16cid="http://schemas.microsoft.com/office/word/2016/wordml/cid" xmlns:w16="http://schemas.microsoft.com/office/word/2018/wordml" xmlns:w16sdtdh="http://schemas.microsoft.com/office/word/2020/wordml/sdtdatahash" xmlns:w16sdtfl="http://schemas.microsoft.com/office/word/2024/wordml/sdtformatlock" xmlns:w16se="http://schemas.microsoft.com/office/word/2015/wordml/symex" xmlns:w16du="http://schemas.microsoft.com/office/word/2023/wordml/word16du" xmlns:wne="http://schemas.microsoft.com/office/word/2006/wordml" mc:Ignorable="w14 w15 w16se w16cid w16 w16cex w16sdtdh w16sdtfl w16du wp14">
   <w:body>
     <w:p>
       <w:pPr>
@@ -2971,7 +2971,19 @@
           <w:rPr>
             <w:rStyle w:val="Hyperlink"/>
           </w:rPr>
-          <w:t>link</w:t>
+          <w:t>li</w:t>
+        </w:r>
+        <w:r>
+          <w:rPr>
+            <w:rStyle w:val="Hyperlink"/>
+          </w:rPr>
+          <w:t>n</w:t>
+        </w:r>
+        <w:r>
+          <w:rPr>
+            <w:rStyle w:val="Hyperlink"/>
+          </w:rPr>
+          <w:t>k</w:t>
         </w:r>
       </w:hyperlink>
     </w:p>
@@ -2984,7 +2996,13 @@
           <w:rPr>
             <w:rStyle w:val="Hyperlink"/>
           </w:rPr>
-          <w:t>link</w:t>
+          <w:t>lin</w:t>
+        </w:r>
+        <w:r>
+          <w:rPr>
+            <w:rStyle w:val="Hyperlink"/>
+          </w:rPr>
+          <w:t>k</w:t>
         </w:r>
       </w:hyperlink>
       <w:r>
@@ -3074,37 +3092,7 @@
         </w:numPr>
       </w:pPr>
       <w:r>
-        <w:t>“</w:t>
-      </w:r>
-      <w:r>
-        <w:t>Arts, entertainment,</w:t>
-      </w:r>
-      <w:r>
-        <w:t xml:space="preserve"> and</w:t>
-      </w:r>
-      <w:r>
-        <w:t xml:space="preserve"> recreation</w:t>
-      </w:r>
-      <w:r>
-        <w:t>” +</w:t>
-      </w:r>
-      <w:r>
-        <w:t xml:space="preserve"> </w:t>
-      </w:r>
-      <w:r>
-        <w:t>“A</w:t>
-      </w:r>
-      <w:r>
-        <w:t>ccommodation and food services</w:t>
-      </w:r>
-      <w:r>
-        <w:t>” = “</w:t>
-      </w:r>
-      <w:r>
-        <w:t>Arts, entertainment, recreation, accommodation, and food services</w:t>
-      </w:r>
-      <w:r>
-        <w:t>”</w:t>
+        <w:t>“Arts, entertainment, and recreation” + “Accommodation and food services” = “Arts, entertainment, recreation, accommodation, and food services”</w:t>
       </w:r>
     </w:p>
     <w:p>
@@ -3116,31 +3104,7 @@
         </w:numPr>
       </w:pPr>
       <w:r>
-        <w:t>“</w:t>
-      </w:r>
-      <w:r>
-        <w:t>Administrative and support and waste management services</w:t>
-      </w:r>
-      <w:r>
-        <w:t>” + “</w:t>
-      </w:r>
-      <w:r>
-        <w:t>Management of companies and enterprises</w:t>
-      </w:r>
-      <w:r>
-        <w:t>” + “</w:t>
-      </w:r>
-      <w:r>
-        <w:t>Professional, scientific, and technical services</w:t>
-      </w:r>
-      <w:r>
-        <w:t>” = “</w:t>
-      </w:r>
-      <w:r>
-        <w:t>Professional and business services</w:t>
-      </w:r>
-      <w:r>
-        <w:t>”</w:t>
+        <w:t>“Administrative and support and waste management services” + “Management of companies and enterprises” + “Professional, scientific, and technical services” = “Professional and business services”</w:t>
       </w:r>
     </w:p>
     <w:p/>
@@ -3159,7 +3123,19 @@
           <w:rPr>
             <w:rStyle w:val="Hyperlink"/>
           </w:rPr>
-          <w:t>link</w:t>
+          <w:t>li</w:t>
+        </w:r>
+        <w:r>
+          <w:rPr>
+            <w:rStyle w:val="Hyperlink"/>
+          </w:rPr>
+          <w:t>n</w:t>
+        </w:r>
+        <w:r>
+          <w:rPr>
+            <w:rStyle w:val="Hyperlink"/>
+          </w:rPr>
+          <w:t>k</w:t>
         </w:r>
       </w:hyperlink>
     </w:p>
@@ -3266,7 +3242,13 @@
           <w:rPr>
             <w:rStyle w:val="Hyperlink"/>
           </w:rPr>
-          <w:t>pag</w:t>
+          <w:t>pa</w:t>
+        </w:r>
+        <w:r>
+          <w:rPr>
+            <w:rStyle w:val="Hyperlink"/>
+          </w:rPr>
+          <w:t>g</w:t>
         </w:r>
         <w:r>
           <w:rPr>
@@ -3394,7 +3376,19 @@
           <w:rPr>
             <w:rStyle w:val="Hyperlink"/>
           </w:rPr>
-          <w:t>codes</w:t>
+          <w:t>cod</w:t>
+        </w:r>
+        <w:r>
+          <w:rPr>
+            <w:rStyle w:val="Hyperlink"/>
+          </w:rPr>
+          <w:t>e</w:t>
+        </w:r>
+        <w:r>
+          <w:rPr>
+            <w:rStyle w:val="Hyperlink"/>
+          </w:rPr>
+          <w:t>s</w:t>
         </w:r>
       </w:hyperlink>
       <w:r>
@@ -3471,7 +3465,19 @@
           <w:rPr>
             <w:rStyle w:val="Hyperlink"/>
           </w:rPr>
-          <w:t>codes</w:t>
+          <w:t>co</w:t>
+        </w:r>
+        <w:r>
+          <w:rPr>
+            <w:rStyle w:val="Hyperlink"/>
+          </w:rPr>
+          <w:t>d</w:t>
+        </w:r>
+        <w:r>
+          <w:rPr>
+            <w:rStyle w:val="Hyperlink"/>
+          </w:rPr>
+          <w:t>es</w:t>
         </w:r>
       </w:hyperlink>
       <w:r>
@@ -3493,13 +3499,561 @@
           <w:rPr>
             <w:rStyle w:val="Hyperlink"/>
           </w:rPr>
-          <w:t>website</w:t>
+          <w:t>w</w:t>
+        </w:r>
+        <w:r>
+          <w:rPr>
+            <w:rStyle w:val="Hyperlink"/>
+          </w:rPr>
+          <w:t>e</w:t>
+        </w:r>
+        <w:r>
+          <w:rPr>
+            <w:rStyle w:val="Hyperlink"/>
+          </w:rPr>
+          <w:t>b</w:t>
+        </w:r>
+        <w:r>
+          <w:rPr>
+            <w:rStyle w:val="Hyperlink"/>
+          </w:rPr>
+          <w:t>s</w:t>
+        </w:r>
+        <w:r>
+          <w:rPr>
+            <w:rStyle w:val="Hyperlink"/>
+          </w:rPr>
+          <w:t>ite</w:t>
         </w:r>
       </w:hyperlink>
       <w:r>
         <w:t>.</w:t>
       </w:r>
     </w:p>
+    <w:p/>
+    <w:tbl>
+      <w:tblPr>
+        <w:tblStyle w:val="TableGrid"/>
+        <w:tblW w:w="0" w:type="auto"/>
+        <w:tblLook w:val="04A0" w:firstRow="1" w:lastRow="0" w:firstColumn="1" w:lastColumn="0" w:noHBand="0" w:noVBand="1"/>
+      </w:tblPr>
+      <w:tblGrid>
+        <w:gridCol w:w="4324"/>
+        <w:gridCol w:w="3771"/>
+        <w:gridCol w:w="1255"/>
+      </w:tblGrid>
+      <w:tr>
+        <w:tc>
+          <w:tcPr>
+            <w:tcW w:w="4324" w:type="dxa"/>
+          </w:tcPr>
+          <w:p>
+            <w:r>
+              <w:lastRenderedPageBreak/>
+              <w:t>Raw File</w:t>
+            </w:r>
+          </w:p>
+        </w:tc>
+        <w:tc>
+          <w:tcPr>
+            <w:tcW w:w="3771" w:type="dxa"/>
+          </w:tcPr>
+          <w:p>
+            <w:r>
+              <w:t>Description</w:t>
+            </w:r>
+          </w:p>
+        </w:tc>
+        <w:tc>
+          <w:tcPr>
+            <w:tcW w:w="1255" w:type="dxa"/>
+          </w:tcPr>
+          <w:p>
+            <w:r>
+              <w:t>Link</w:t>
+            </w:r>
+          </w:p>
+        </w:tc>
+      </w:tr>
+      <w:tr>
+        <w:tc>
+          <w:tcPr>
+            <w:tcW w:w="4324" w:type="dxa"/>
+          </w:tcPr>
+          <w:p>
+            <w:r>
+              <w:t>GDPbyIND_VA_1947-1997</w:t>
+            </w:r>
+            <w:r>
+              <w:t>.xlsx</w:t>
+            </w:r>
+          </w:p>
+        </w:tc>
+        <w:tc>
+          <w:tcPr>
+            <w:tcW w:w="3771" w:type="dxa"/>
+          </w:tcPr>
+          <w:p>
+            <w:r>
+              <w:t>1947-1997 annual GDP</w:t>
+            </w:r>
+          </w:p>
+        </w:tc>
+        <w:tc>
+          <w:tcPr>
+            <w:tcW w:w="1255" w:type="dxa"/>
+          </w:tcPr>
+          <w:p>
+            <w:hyperlink r:id="rId55" w:history="1">
+              <w:r>
+                <w:rPr>
+                  <w:rStyle w:val="Hyperlink"/>
+                </w:rPr>
+                <w:t>Link</w:t>
+              </w:r>
+            </w:hyperlink>
+          </w:p>
+        </w:tc>
+      </w:tr>
+      <w:tr>
+        <w:tc>
+          <w:tcPr>
+            <w:tcW w:w="4324" w:type="dxa"/>
+          </w:tcPr>
+          <w:p>
+            <w:r>
+              <w:t>SAGDP2N__ALL_AREAS_1997_2023.csv</w:t>
+            </w:r>
+          </w:p>
+        </w:tc>
+        <w:tc>
+          <w:tcPr>
+            <w:tcW w:w="3771" w:type="dxa"/>
+          </w:tcPr>
+          <w:p>
+            <w:r>
+              <w:t>1997-2023 annual GDP</w:t>
+            </w:r>
+            <w:r>
+              <w:t xml:space="preserve"> (Choose SAGDP)</w:t>
+            </w:r>
+          </w:p>
+        </w:tc>
+        <w:tc>
+          <w:tcPr>
+            <w:tcW w:w="1255" w:type="dxa"/>
+          </w:tcPr>
+          <w:p>
+            <w:hyperlink r:id="rId56" w:history="1">
+              <w:r>
+                <w:rPr>
+                  <w:rStyle w:val="Hyperlink"/>
+                </w:rPr>
+                <w:t>Li</w:t>
+              </w:r>
+              <w:r>
+                <w:rPr>
+                  <w:rStyle w:val="Hyperlink"/>
+                </w:rPr>
+                <w:t>n</w:t>
+              </w:r>
+              <w:r>
+                <w:rPr>
+                  <w:rStyle w:val="Hyperlink"/>
+                </w:rPr>
+                <w:t>k</w:t>
+              </w:r>
+            </w:hyperlink>
+          </w:p>
+        </w:tc>
+      </w:tr>
+      <w:tr>
+        <w:tc>
+          <w:tcPr>
+            <w:tcW w:w="4324" w:type="dxa"/>
+          </w:tcPr>
+          <w:p>
+            <w:r>
+              <w:t>SQGDP9_US_2005_2023.csv</w:t>
+            </w:r>
+          </w:p>
+        </w:tc>
+        <w:tc>
+          <w:tcPr>
+            <w:tcW w:w="3771" w:type="dxa"/>
+          </w:tcPr>
+          <w:p>
+            <w:r>
+              <w:t>Quarterly real GDP</w:t>
+            </w:r>
+            <w:r>
+              <w:t xml:space="preserve"> (Choose SQGDP)</w:t>
+            </w:r>
+          </w:p>
+        </w:tc>
+        <w:tc>
+          <w:tcPr>
+            <w:tcW w:w="1255" w:type="dxa"/>
+          </w:tcPr>
+          <w:p>
+            <w:hyperlink r:id="rId57" w:history="1">
+              <w:r>
+                <w:rPr>
+                  <w:rStyle w:val="Hyperlink"/>
+                </w:rPr>
+                <w:t>Link</w:t>
+              </w:r>
+            </w:hyperlink>
+          </w:p>
+        </w:tc>
+      </w:tr>
+      <w:tr>
+        <w:tc>
+          <w:tcPr>
+            <w:tcW w:w="4324" w:type="dxa"/>
+          </w:tcPr>
+          <w:p>
+            <w:r>
+              <w:t>SQGDP</w:t>
+            </w:r>
+            <w:r>
+              <w:t>2</w:t>
+            </w:r>
+            <w:r>
+              <w:t>_US_2005_2023.csv</w:t>
+            </w:r>
+          </w:p>
+        </w:tc>
+        <w:tc>
+          <w:tcPr>
+            <w:tcW w:w="3771" w:type="dxa"/>
+          </w:tcPr>
+          <w:p>
+            <w:r>
+              <w:t>Quarterly nominal GDP</w:t>
+            </w:r>
+            <w:r>
+              <w:t xml:space="preserve"> (Choose SQGDP)</w:t>
+            </w:r>
+          </w:p>
+        </w:tc>
+        <w:tc>
+          <w:tcPr>
+            <w:tcW w:w="1255" w:type="dxa"/>
+          </w:tcPr>
+          <w:p>
+            <w:hyperlink r:id="rId58" w:history="1">
+              <w:r>
+                <w:rPr>
+                  <w:rStyle w:val="Hyperlink"/>
+                </w:rPr>
+                <w:t>Link</w:t>
+              </w:r>
+            </w:hyperlink>
+          </w:p>
+        </w:tc>
+      </w:tr>
+      <w:tr>
+        <w:tc>
+          <w:tcPr>
+            <w:tcW w:w="4324" w:type="dxa"/>
+          </w:tcPr>
+          <w:p>
+            <w:proofErr w:type="gramStart"/>
+            <w:r>
+              <w:t>PriceIndices(</w:t>
+            </w:r>
+            <w:proofErr w:type="gramEnd"/>
+            <w:r>
+              <w:t>97-23).xlsx</w:t>
+            </w:r>
+          </w:p>
+        </w:tc>
+        <w:tc>
+          <w:tcPr>
+            <w:tcW w:w="3771" w:type="dxa"/>
+          </w:tcPr>
+          <w:p>
+            <w:r>
+              <w:t>Annual 1997-2023 price index</w:t>
+            </w:r>
+          </w:p>
+        </w:tc>
+        <w:tc>
+          <w:tcPr>
+            <w:tcW w:w="1255" w:type="dxa"/>
+          </w:tcPr>
+          <w:p>
+            <w:hyperlink r:id="rId59" w:anchor="eyJhcHBpZCI6MTYwMywic3RlcHMiOlsxLDIsNF0sImRhdGEiOltbImNhdGVnb3JpZXMiLCJHRFB4SW5kIl0sWyJUYWJsZV9MaXN0IiwiVFZBMTA0Il1dfQ==" w:history="1">
+              <w:r>
+                <w:rPr>
+                  <w:rStyle w:val="Hyperlink"/>
+                </w:rPr>
+                <w:t>Link</w:t>
+              </w:r>
+            </w:hyperlink>
+          </w:p>
+        </w:tc>
+      </w:tr>
+      <w:tr>
+        <w:tc>
+          <w:tcPr>
+            <w:tcW w:w="4324" w:type="dxa"/>
+          </w:tcPr>
+          <w:p>
+            <w:proofErr w:type="spellStart"/>
+            <w:r>
+              <w:t>Indcleaned.dta</w:t>
+            </w:r>
+            <w:proofErr w:type="spellEnd"/>
+          </w:p>
+        </w:tc>
+        <w:tc>
+          <w:tcPr>
+            <w:tcW w:w="3771" w:type="dxa"/>
+          </w:tcPr>
+          <w:p>
+            <w:r>
+              <w:t xml:space="preserve">Crosswalk created by hand by me (using IPUMS codes to match to BEA </w:t>
+            </w:r>
+            <w:proofErr w:type="spellStart"/>
+            <w:r>
+              <w:t>LineCode</w:t>
+            </w:r>
+            <w:proofErr w:type="spellEnd"/>
+            <w:r>
+              <w:t xml:space="preserve"> categories</w:t>
+            </w:r>
+          </w:p>
+        </w:tc>
+        <w:tc>
+          <w:tcPr>
+            <w:tcW w:w="1255" w:type="dxa"/>
+          </w:tcPr>
+          <w:p>
+            <w:hyperlink r:id="rId60" w:history="1">
+              <w:r>
+                <w:rPr>
+                  <w:rStyle w:val="Hyperlink"/>
+                </w:rPr>
+                <w:t>Link</w:t>
+              </w:r>
+            </w:hyperlink>
+          </w:p>
+        </w:tc>
+      </w:tr>
+      <w:tr>
+        <w:tc>
+          <w:tcPr>
+            <w:tcW w:w="4324" w:type="dxa"/>
+          </w:tcPr>
+          <w:p>
+            <w:proofErr w:type="spellStart"/>
+            <w:r>
+              <w:t>Industrycodes.dta</w:t>
+            </w:r>
+            <w:proofErr w:type="spellEnd"/>
+          </w:p>
+        </w:tc>
+        <w:tc>
+          <w:tcPr>
+            <w:tcW w:w="3771" w:type="dxa"/>
+          </w:tcPr>
+          <w:p>
+            <w:r>
+              <w:t>Parses series IDs</w:t>
+            </w:r>
+          </w:p>
+        </w:tc>
+        <w:tc>
+          <w:tcPr>
+            <w:tcW w:w="1255" w:type="dxa"/>
+          </w:tcPr>
+          <w:p>
+            <w:hyperlink r:id="rId61" w:history="1">
+              <w:r>
+                <w:rPr>
+                  <w:rStyle w:val="Hyperlink"/>
+                </w:rPr>
+                <w:t>Link</w:t>
+              </w:r>
+            </w:hyperlink>
+          </w:p>
+        </w:tc>
+      </w:tr>
+      <w:tr>
+        <w:tc>
+          <w:tcPr>
+            <w:tcW w:w="4324" w:type="dxa"/>
+          </w:tcPr>
+          <w:p>
+            <w:proofErr w:type="spellStart"/>
+            <w:r>
+              <w:t>Statecodes.dta</w:t>
+            </w:r>
+            <w:proofErr w:type="spellEnd"/>
+          </w:p>
+        </w:tc>
+        <w:tc>
+          <w:tcPr>
+            <w:tcW w:w="3771" w:type="dxa"/>
+          </w:tcPr>
+          <w:p>
+            <w:r>
+              <w:t>Parses series IDs</w:t>
+            </w:r>
+          </w:p>
+        </w:tc>
+        <w:tc>
+          <w:tcPr>
+            <w:tcW w:w="1255" w:type="dxa"/>
+          </w:tcPr>
+          <w:p>
+            <w:hyperlink r:id="rId62" w:anchor="SM" w:history="1">
+              <w:r>
+                <w:rPr>
+                  <w:rStyle w:val="Hyperlink"/>
+                </w:rPr>
+                <w:t>Link</w:t>
+              </w:r>
+            </w:hyperlink>
+          </w:p>
+        </w:tc>
+      </w:tr>
+      <w:tr>
+        <w:tc>
+          <w:tcPr>
+            <w:tcW w:w="4324" w:type="dxa"/>
+          </w:tcPr>
+          <w:p>
+            <w:r>
+              <w:t>MasterSeries.xlsx</w:t>
+            </w:r>
+          </w:p>
+        </w:tc>
+        <w:tc>
+          <w:tcPr>
+            <w:tcW w:w="3771" w:type="dxa"/>
+          </w:tcPr>
+          <w:p>
+            <w:r>
+              <w:t>State and Metro Area Employment, Hours, and Earnings (SAE)</w:t>
+            </w:r>
+          </w:p>
+        </w:tc>
+        <w:tc>
+          <w:tcPr>
+            <w:tcW w:w="1255" w:type="dxa"/>
+          </w:tcPr>
+          <w:p>
+            <w:hyperlink r:id="rId63" w:history="1">
+              <w:r>
+                <w:rPr>
+                  <w:rStyle w:val="Hyperlink"/>
+                </w:rPr>
+                <w:t>Link</w:t>
+              </w:r>
+            </w:hyperlink>
+          </w:p>
+        </w:tc>
+      </w:tr>
+      <w:tr>
+        <w:tc>
+          <w:tcPr>
+            <w:tcW w:w="4324" w:type="dxa"/>
+          </w:tcPr>
+          <w:p>
+            <w:r>
+              <w:t>CPS_38,39,40,44,47,50</w:t>
+            </w:r>
+          </w:p>
+        </w:tc>
+        <w:tc>
+          <w:tcPr>
+            <w:tcW w:w="3771" w:type="dxa"/>
+          </w:tcPr>
+          <w:p>
+            <w:r>
+              <w:t>Pulled from IPUMS (detailed above)</w:t>
+            </w:r>
+          </w:p>
+        </w:tc>
+        <w:tc>
+          <w:tcPr>
+            <w:tcW w:w="1255" w:type="dxa"/>
+          </w:tcPr>
+          <w:p/>
+        </w:tc>
+      </w:tr>
+      <w:tr>
+        <w:tc>
+          <w:tcPr>
+            <w:tcW w:w="4324" w:type="dxa"/>
+          </w:tcPr>
+          <w:p>
+            <w:proofErr w:type="spellStart"/>
+            <w:r>
+              <w:t>Morg</w:t>
+            </w:r>
+            <w:proofErr w:type="spellEnd"/>
+          </w:p>
+        </w:tc>
+        <w:tc>
+          <w:tcPr>
+            <w:tcW w:w="3771" w:type="dxa"/>
+          </w:tcPr>
+          <w:p>
+            <w:r>
+              <w:t>From Camilos JMP</w:t>
+            </w:r>
+          </w:p>
+        </w:tc>
+        <w:tc>
+          <w:tcPr>
+            <w:tcW w:w="1255" w:type="dxa"/>
+          </w:tcPr>
+          <w:p/>
+        </w:tc>
+      </w:tr>
+      <w:tr>
+        <w:tc>
+          <w:tcPr>
+            <w:tcW w:w="4324" w:type="dxa"/>
+          </w:tcPr>
+          <w:p>
+            <w:r>
+              <w:t>Ind90_00.xlsx</w:t>
+            </w:r>
+          </w:p>
+        </w:tc>
+        <w:tc>
+          <w:tcPr>
+            <w:tcW w:w="3771" w:type="dxa"/>
+          </w:tcPr>
+          <w:p>
+            <w:r>
+              <w:t>Ind 1990 to Line Code</w:t>
+            </w:r>
+          </w:p>
+        </w:tc>
+        <w:tc>
+          <w:tcPr>
+            <w:tcW w:w="1255" w:type="dxa"/>
+          </w:tcPr>
+          <w:p>
+            <w:hyperlink r:id="rId64" w:history="1">
+              <w:r>
+                <w:rPr>
+                  <w:rStyle w:val="Hyperlink"/>
+                </w:rPr>
+                <w:t>Link</w:t>
+              </w:r>
+            </w:hyperlink>
+          </w:p>
+        </w:tc>
+      </w:tr>
+    </w:tbl>
+    <w:p/>
     <w:p/>
     <w:sectPr>
       <w:pgSz w:w="12240" w:h="15840"/>
@@ -3512,7 +4066,7 @@
 </file>
 
 <file path=word/endnotes.xml><?xml version="1.0" encoding="utf-8"?>
-<w:endnotes xmlns:wpc="http://schemas.microsoft.com/office/word/2010/wordprocessingCanvas" xmlns:cx="http://schemas.microsoft.com/office/drawing/2014/chartex" xmlns:cx1="http://schemas.microsoft.com/office/drawing/2015/9/8/chartex" xmlns:cx2="http://schemas.microsoft.com/office/drawing/2015/10/21/chartex" xmlns:cx3="http://schemas.microsoft.com/office/drawing/2016/5/9/chartex" xmlns:cx4="http://schemas.microsoft.com/office/drawing/2016/5/10/chartex" xmlns:cx5="http://schemas.microsoft.com/office/drawing/2016/5/11/chartex" xmlns:cx6="http://schemas.microsoft.com/office/drawing/2016/5/12/chartex" xmlns:cx7="http://schemas.microsoft.com/office/drawing/2016/5/13/chartex" xmlns:cx8="http://schemas.microsoft.com/office/drawing/2016/5/14/chartex" xmlns:mc="http://schemas.openxmlformats.org/markup-compatibility/2006" xmlns:aink="http://schemas.microsoft.com/office/drawing/2016/ink" xmlns:am3d="http://schemas.microsoft.com/office/drawing/2017/model3d" xmlns:o="urn:schemas-microsoft-com:office:office" xmlns:oel="http://schemas.microsoft.com/office/2019/extlst" xmlns:r="http://schemas.openxmlformats.org/officeDocument/2006/relationships" xmlns:m="http://schemas.openxmlformats.org/officeDocument/2006/math" xmlns:v="urn:schemas-microsoft-com:vml" xmlns:wp14="http://schemas.microsoft.com/office/word/2010/wordprocessingDrawing" xmlns:wp="http://schemas.openxmlformats.org/drawingml/2006/wordprocessingDrawing" xmlns:w10="urn:schemas-microsoft-com:office:word" xmlns:w="http://schemas.openxmlformats.org/wordprocessingml/2006/main" xmlns:w14="http://schemas.microsoft.com/office/word/2010/wordml" xmlns:w15="http://schemas.microsoft.com/office/word/2012/wordml" xmlns:w16cex="http://schemas.microsoft.com/office/word/2018/wordml/cex" xmlns:w16cid="http://schemas.microsoft.com/office/word/2016/wordml/cid" xmlns:w16="http://schemas.microsoft.com/office/word/2018/wordml" xmlns:w16du="http://schemas.microsoft.com/office/word/2023/wordml/word16du" xmlns:w16sdtdh="http://schemas.microsoft.com/office/word/2020/wordml/sdtdatahash" xmlns:w16se="http://schemas.microsoft.com/office/word/2015/wordml/symex" xmlns:wpg="http://schemas.microsoft.com/office/word/2010/wordprocessingGroup" xmlns:wpi="http://schemas.microsoft.com/office/word/2010/wordprocessingInk" xmlns:wne="http://schemas.microsoft.com/office/word/2006/wordml" xmlns:wps="http://schemas.microsoft.com/office/word/2010/wordprocessingShape" mc:Ignorable="w14 w15 w16se w16cid w16 w16cex w16sdtdh w16du wp14">
+<w:endnotes xmlns:wpc="http://schemas.microsoft.com/office/word/2010/wordprocessingCanvas" xmlns:cx="http://schemas.microsoft.com/office/drawing/2014/chartex" xmlns:cx1="http://schemas.microsoft.com/office/drawing/2015/9/8/chartex" xmlns:cx2="http://schemas.microsoft.com/office/drawing/2015/10/21/chartex" xmlns:cx3="http://schemas.microsoft.com/office/drawing/2016/5/9/chartex" xmlns:cx4="http://schemas.microsoft.com/office/drawing/2016/5/10/chartex" xmlns:cx5="http://schemas.microsoft.com/office/drawing/2016/5/11/chartex" xmlns:cx6="http://schemas.microsoft.com/office/drawing/2016/5/12/chartex" xmlns:cx7="http://schemas.microsoft.com/office/drawing/2016/5/13/chartex" xmlns:cx8="http://schemas.microsoft.com/office/drawing/2016/5/14/chartex" xmlns:mc="http://schemas.openxmlformats.org/markup-compatibility/2006" xmlns:m="http://schemas.openxmlformats.org/officeDocument/2006/math" xmlns:aink="http://schemas.microsoft.com/office/drawing/2016/ink" xmlns:am3d="http://schemas.microsoft.com/office/drawing/2017/model3d" xmlns:oel="http://schemas.microsoft.com/office/2019/extlst" xmlns:r="http://schemas.openxmlformats.org/officeDocument/2006/relationships" xmlns:wp14="http://schemas.microsoft.com/office/word/2010/wordprocessingDrawing" xmlns:wp="http://schemas.openxmlformats.org/drawingml/2006/wordprocessingDrawing" xmlns:wpg="http://schemas.microsoft.com/office/word/2010/wordprocessingGroup" xmlns:wpi="http://schemas.microsoft.com/office/word/2010/wordprocessingInk" xmlns:wps="http://schemas.microsoft.com/office/word/2010/wordprocessingShape" xmlns:o="urn:schemas-microsoft-com:office:office" xmlns:v="urn:schemas-microsoft-com:vml" xmlns:w10="urn:schemas-microsoft-com:office:word" xmlns:w="http://schemas.openxmlformats.org/wordprocessingml/2006/main" xmlns:w14="http://schemas.microsoft.com/office/word/2010/wordml" xmlns:w15="http://schemas.microsoft.com/office/word/2012/wordml" xmlns:w16cei="http://schemas.microsoft.com/office/word/2026/wordml/cei" xmlns:w16cex="http://schemas.microsoft.com/office/word/2018/wordml/cex" xmlns:w16cid="http://schemas.microsoft.com/office/word/2016/wordml/cid" xmlns:w16="http://schemas.microsoft.com/office/word/2018/wordml" xmlns:w16sdtdh="http://schemas.microsoft.com/office/word/2020/wordml/sdtdatahash" xmlns:w16sdtfl="http://schemas.microsoft.com/office/word/2024/wordml/sdtformatlock" xmlns:w16se="http://schemas.microsoft.com/office/word/2015/wordml/symex" xmlns:w16du="http://schemas.microsoft.com/office/word/2023/wordml/word16du" xmlns:wne="http://schemas.microsoft.com/office/word/2006/wordml" mc:Ignorable="w14 w15 w16se w16cid w16 w16cex w16sdtdh w16sdtfl w16du wp14">
   <w:endnote w:type="separator" w:id="-1">
     <w:p>
       <w:r>
@@ -3531,7 +4085,7 @@
 </file>
 
 <file path=word/footnotes.xml><?xml version="1.0" encoding="utf-8"?>
-<w:footnotes xmlns:wpc="http://schemas.microsoft.com/office/word/2010/wordprocessingCanvas" xmlns:cx="http://schemas.microsoft.com/office/drawing/2014/chartex" xmlns:cx1="http://schemas.microsoft.com/office/drawing/2015/9/8/chartex" xmlns:cx2="http://schemas.microsoft.com/office/drawing/2015/10/21/chartex" xmlns:cx3="http://schemas.microsoft.com/office/drawing/2016/5/9/chartex" xmlns:cx4="http://schemas.microsoft.com/office/drawing/2016/5/10/chartex" xmlns:cx5="http://schemas.microsoft.com/office/drawing/2016/5/11/chartex" xmlns:cx6="http://schemas.microsoft.com/office/drawing/2016/5/12/chartex" xmlns:cx7="http://schemas.microsoft.com/office/drawing/2016/5/13/chartex" xmlns:cx8="http://schemas.microsoft.com/office/drawing/2016/5/14/chartex" xmlns:mc="http://schemas.openxmlformats.org/markup-compatibility/2006" xmlns:aink="http://schemas.microsoft.com/office/drawing/2016/ink" xmlns:am3d="http://schemas.microsoft.com/office/drawing/2017/model3d" xmlns:o="urn:schemas-microsoft-com:office:office" xmlns:oel="http://schemas.microsoft.com/office/2019/extlst" xmlns:r="http://schemas.openxmlformats.org/officeDocument/2006/relationships" xmlns:m="http://schemas.openxmlformats.org/officeDocument/2006/math" xmlns:v="urn:schemas-microsoft-com:vml" xmlns:wp14="http://schemas.microsoft.com/office/word/2010/wordprocessingDrawing" xmlns:wp="http://schemas.openxmlformats.org/drawingml/2006/wordprocessingDrawing" xmlns:w10="urn:schemas-microsoft-com:office:word" xmlns:w="http://schemas.openxmlformats.org/wordprocessingml/2006/main" xmlns:w14="http://schemas.microsoft.com/office/word/2010/wordml" xmlns:w15="http://schemas.microsoft.com/office/word/2012/wordml" xmlns:w16cex="http://schemas.microsoft.com/office/word/2018/wordml/cex" xmlns:w16cid="http://schemas.microsoft.com/office/word/2016/wordml/cid" xmlns:w16="http://schemas.microsoft.com/office/word/2018/wordml" xmlns:w16du="http://schemas.microsoft.com/office/word/2023/wordml/word16du" xmlns:w16sdtdh="http://schemas.microsoft.com/office/word/2020/wordml/sdtdatahash" xmlns:w16se="http://schemas.microsoft.com/office/word/2015/wordml/symex" xmlns:wpg="http://schemas.microsoft.com/office/word/2010/wordprocessingGroup" xmlns:wpi="http://schemas.microsoft.com/office/word/2010/wordprocessingInk" xmlns:wne="http://schemas.microsoft.com/office/word/2006/wordml" xmlns:wps="http://schemas.microsoft.com/office/word/2010/wordprocessingShape" mc:Ignorable="w14 w15 w16se w16cid w16 w16cex w16sdtdh w16du wp14">
+<w:footnotes xmlns:wpc="http://schemas.microsoft.com/office/word/2010/wordprocessingCanvas" xmlns:cx="http://schemas.microsoft.com/office/drawing/2014/chartex" xmlns:cx1="http://schemas.microsoft.com/office/drawing/2015/9/8/chartex" xmlns:cx2="http://schemas.microsoft.com/office/drawing/2015/10/21/chartex" xmlns:cx3="http://schemas.microsoft.com/office/drawing/2016/5/9/chartex" xmlns:cx4="http://schemas.microsoft.com/office/drawing/2016/5/10/chartex" xmlns:cx5="http://schemas.microsoft.com/office/drawing/2016/5/11/chartex" xmlns:cx6="http://schemas.microsoft.com/office/drawing/2016/5/12/chartex" xmlns:cx7="http://schemas.microsoft.com/office/drawing/2016/5/13/chartex" xmlns:cx8="http://schemas.microsoft.com/office/drawing/2016/5/14/chartex" xmlns:mc="http://schemas.openxmlformats.org/markup-compatibility/2006" xmlns:m="http://schemas.openxmlformats.org/officeDocument/2006/math" xmlns:aink="http://schemas.microsoft.com/office/drawing/2016/ink" xmlns:am3d="http://schemas.microsoft.com/office/drawing/2017/model3d" xmlns:oel="http://schemas.microsoft.com/office/2019/extlst" xmlns:r="http://schemas.openxmlformats.org/officeDocument/2006/relationships" xmlns:wp14="http://schemas.microsoft.com/office/word/2010/wordprocessingDrawing" xmlns:wp="http://schemas.openxmlformats.org/drawingml/2006/wordprocessingDrawing" xmlns:wpg="http://schemas.microsoft.com/office/word/2010/wordprocessingGroup" xmlns:wpi="http://schemas.microsoft.com/office/word/2010/wordprocessingInk" xmlns:wps="http://schemas.microsoft.com/office/word/2010/wordprocessingShape" xmlns:o="urn:schemas-microsoft-com:office:office" xmlns:v="urn:schemas-microsoft-com:vml" xmlns:w10="urn:schemas-microsoft-com:office:word" xmlns:w="http://schemas.openxmlformats.org/wordprocessingml/2006/main" xmlns:w14="http://schemas.microsoft.com/office/word/2010/wordml" xmlns:w15="http://schemas.microsoft.com/office/word/2012/wordml" xmlns:w16cei="http://schemas.microsoft.com/office/word/2026/wordml/cei" xmlns:w16cex="http://schemas.microsoft.com/office/word/2018/wordml/cex" xmlns:w16cid="http://schemas.microsoft.com/office/word/2016/wordml/cid" xmlns:w16="http://schemas.microsoft.com/office/word/2018/wordml" xmlns:w16sdtdh="http://schemas.microsoft.com/office/word/2020/wordml/sdtdatahash" xmlns:w16sdtfl="http://schemas.microsoft.com/office/word/2024/wordml/sdtformatlock" xmlns:w16se="http://schemas.microsoft.com/office/word/2015/wordml/symex" xmlns:w16du="http://schemas.microsoft.com/office/word/2023/wordml/word16du" xmlns:wne="http://schemas.microsoft.com/office/word/2006/wordml" mc:Ignorable="w14 w15 w16se w16cid w16 w16cex w16sdtdh w16sdtfl w16du wp14">
   <w:footnote w:type="separator" w:id="-1">
     <w:p>
       <w:r>
@@ -3585,7 +4139,7 @@
 </file>
 
 <file path=word/numbering.xml><?xml version="1.0" encoding="utf-8"?>
-<w:numbering xmlns:wpc="http://schemas.microsoft.com/office/word/2010/wordprocessingCanvas" xmlns:cx="http://schemas.microsoft.com/office/drawing/2014/chartex" xmlns:cx1="http://schemas.microsoft.com/office/drawing/2015/9/8/chartex" xmlns:cx2="http://schemas.microsoft.com/office/drawing/2015/10/21/chartex" xmlns:cx3="http://schemas.microsoft.com/office/drawing/2016/5/9/chartex" xmlns:cx4="http://schemas.microsoft.com/office/drawing/2016/5/10/chartex" xmlns:cx5="http://schemas.microsoft.com/office/drawing/2016/5/11/chartex" xmlns:cx6="http://schemas.microsoft.com/office/drawing/2016/5/12/chartex" xmlns:cx7="http://schemas.microsoft.com/office/drawing/2016/5/13/chartex" xmlns:cx8="http://schemas.microsoft.com/office/drawing/2016/5/14/chartex" xmlns:mc="http://schemas.openxmlformats.org/markup-compatibility/2006" xmlns:aink="http://schemas.microsoft.com/office/drawing/2016/ink" xmlns:am3d="http://schemas.microsoft.com/office/drawing/2017/model3d" xmlns:o="urn:schemas-microsoft-com:office:office" xmlns:oel="http://schemas.microsoft.com/office/2019/extlst" xmlns:r="http://schemas.openxmlformats.org/officeDocument/2006/relationships" xmlns:m="http://schemas.openxmlformats.org/officeDocument/2006/math" xmlns:v="urn:schemas-microsoft-com:vml" xmlns:wp14="http://schemas.microsoft.com/office/word/2010/wordprocessingDrawing" xmlns:wp="http://schemas.openxmlformats.org/drawingml/2006/wordprocessingDrawing" xmlns:w10="urn:schemas-microsoft-com:office:word" xmlns:w="http://schemas.openxmlformats.org/wordprocessingml/2006/main" xmlns:w14="http://schemas.microsoft.com/office/word/2010/wordml" xmlns:w15="http://schemas.microsoft.com/office/word/2012/wordml" xmlns:w16cex="http://schemas.microsoft.com/office/word/2018/wordml/cex" xmlns:w16cid="http://schemas.microsoft.com/office/word/2016/wordml/cid" xmlns:w16="http://schemas.microsoft.com/office/word/2018/wordml" xmlns:w16du="http://schemas.microsoft.com/office/word/2023/wordml/word16du" xmlns:w16sdtdh="http://schemas.microsoft.com/office/word/2020/wordml/sdtdatahash" xmlns:w16se="http://schemas.microsoft.com/office/word/2015/wordml/symex" xmlns:wpg="http://schemas.microsoft.com/office/word/2010/wordprocessingGroup" xmlns:wpi="http://schemas.microsoft.com/office/word/2010/wordprocessingInk" xmlns:wne="http://schemas.microsoft.com/office/word/2006/wordml" xmlns:wps="http://schemas.microsoft.com/office/word/2010/wordprocessingShape" mc:Ignorable="w14 w15 w16se w16cid w16 w16cex w16sdtdh w16du wp14">
+<w:numbering xmlns:wpc="http://schemas.microsoft.com/office/word/2010/wordprocessingCanvas" xmlns:cx="http://schemas.microsoft.com/office/drawing/2014/chartex" xmlns:cx1="http://schemas.microsoft.com/office/drawing/2015/9/8/chartex" xmlns:cx2="http://schemas.microsoft.com/office/drawing/2015/10/21/chartex" xmlns:cx3="http://schemas.microsoft.com/office/drawing/2016/5/9/chartex" xmlns:cx4="http://schemas.microsoft.com/office/drawing/2016/5/10/chartex" xmlns:cx5="http://schemas.microsoft.com/office/drawing/2016/5/11/chartex" xmlns:cx6="http://schemas.microsoft.com/office/drawing/2016/5/12/chartex" xmlns:cx7="http://schemas.microsoft.com/office/drawing/2016/5/13/chartex" xmlns:cx8="http://schemas.microsoft.com/office/drawing/2016/5/14/chartex" xmlns:mc="http://schemas.openxmlformats.org/markup-compatibility/2006" xmlns:m="http://schemas.openxmlformats.org/officeDocument/2006/math" xmlns:aink="http://schemas.microsoft.com/office/drawing/2016/ink" xmlns:am3d="http://schemas.microsoft.com/office/drawing/2017/model3d" xmlns:oel="http://schemas.microsoft.com/office/2019/extlst" xmlns:r="http://schemas.openxmlformats.org/officeDocument/2006/relationships" xmlns:wp14="http://schemas.microsoft.com/office/word/2010/wordprocessingDrawing" xmlns:wp="http://schemas.openxmlformats.org/drawingml/2006/wordprocessingDrawing" xmlns:wpg="http://schemas.microsoft.com/office/word/2010/wordprocessingGroup" xmlns:wpi="http://schemas.microsoft.com/office/word/2010/wordprocessingInk" xmlns:wps="http://schemas.microsoft.com/office/word/2010/wordprocessingShape" xmlns:o="urn:schemas-microsoft-com:office:office" xmlns:v="urn:schemas-microsoft-com:vml" xmlns:w10="urn:schemas-microsoft-com:office:word" xmlns:w="http://schemas.openxmlformats.org/wordprocessingml/2006/main" xmlns:w14="http://schemas.microsoft.com/office/word/2010/wordml" xmlns:w15="http://schemas.microsoft.com/office/word/2012/wordml" xmlns:w16cei="http://schemas.microsoft.com/office/word/2026/wordml/cei" xmlns:w16cex="http://schemas.microsoft.com/office/word/2018/wordml/cex" xmlns:w16cid="http://schemas.microsoft.com/office/word/2016/wordml/cid" xmlns:w16="http://schemas.microsoft.com/office/word/2018/wordml" xmlns:w16sdtdh="http://schemas.microsoft.com/office/word/2020/wordml/sdtdatahash" xmlns:w16sdtfl="http://schemas.microsoft.com/office/word/2024/wordml/sdtformatlock" xmlns:w16se="http://schemas.microsoft.com/office/word/2015/wordml/symex" xmlns:w16du="http://schemas.microsoft.com/office/word/2023/wordml/word16du" xmlns:wne="http://schemas.microsoft.com/office/word/2006/wordml" mc:Ignorable="w14 w15 w16se w16cid w16 w16cex w16sdtdh w16sdtfl w16du wp14">
   <w:abstractNum w:abstractNumId="0" w15:restartNumberingAfterBreak="0">
     <w:nsid w:val="0136127F"/>
     <w:multiLevelType w:val="hybridMultilevel"/>
@@ -4150,7 +4704,7 @@
 </file>
 
 <file path=word/styles.xml><?xml version="1.0" encoding="utf-8"?>
-<w:styles xmlns:mc="http://schemas.openxmlformats.org/markup-compatibility/2006" xmlns:r="http://schemas.openxmlformats.org/officeDocument/2006/relationships" xmlns:w="http://schemas.openxmlformats.org/wordprocessingml/2006/main" xmlns:w14="http://schemas.microsoft.com/office/word/2010/wordml" xmlns:w15="http://schemas.microsoft.com/office/word/2012/wordml" xmlns:w16cex="http://schemas.microsoft.com/office/word/2018/wordml/cex" xmlns:w16cid="http://schemas.microsoft.com/office/word/2016/wordml/cid" xmlns:w16="http://schemas.microsoft.com/office/word/2018/wordml" xmlns:w16du="http://schemas.microsoft.com/office/word/2023/wordml/word16du" xmlns:w16sdtdh="http://schemas.microsoft.com/office/word/2020/wordml/sdtdatahash" xmlns:w16se="http://schemas.microsoft.com/office/word/2015/wordml/symex" mc:Ignorable="w14 w15 w16se w16cid w16 w16cex w16sdtdh w16du">
+<w:styles xmlns:mc="http://schemas.openxmlformats.org/markup-compatibility/2006" xmlns:r="http://schemas.openxmlformats.org/officeDocument/2006/relationships" xmlns:w="http://schemas.openxmlformats.org/wordprocessingml/2006/main" xmlns:w14="http://schemas.microsoft.com/office/word/2010/wordml" xmlns:w15="http://schemas.microsoft.com/office/word/2012/wordml" xmlns:w16cex="http://schemas.microsoft.com/office/word/2018/wordml/cex" xmlns:w16cid="http://schemas.microsoft.com/office/word/2016/wordml/cid" xmlns:w16="http://schemas.microsoft.com/office/word/2018/wordml" xmlns:w16sdtdh="http://schemas.microsoft.com/office/word/2020/wordml/sdtdatahash" xmlns:w16sdtfl="http://schemas.microsoft.com/office/word/2024/wordml/sdtformatlock" xmlns:w16se="http://schemas.microsoft.com/office/word/2015/wordml/symex" xmlns:w16du="http://schemas.microsoft.com/office/word/2023/wordml/word16du" mc:Ignorable="w14 w15 w16se w16cid w16 w16cex w16sdtdh w16sdtfl w16du">
   <w:docDefaults>
     <w:rPrDefault>
       <w:rPr>
@@ -4746,6 +5300,7 @@
   <w:style w:type="character" w:default="1" w:styleId="DefaultParagraphFont">
     <w:name w:val="Default Paragraph Font"/>
     <w:uiPriority w:val="1"/>
+    <w:semiHidden/>
     <w:unhideWhenUsed/>
   </w:style>
   <w:style w:type="table" w:default="1" w:styleId="TableNormal">

</xml_diff>